<commit_message>
Update CV files and remove temp/duplicate files
Co-Authored-By: Claude Sonnet 4.6 <noreply@anthropic.com>
</commit_message>
<xml_diff>
--- a/CV/Rotem Solomon CV.docx
+++ b/CV/Rotem Solomon CV.docx
@@ -800,19 +800,11 @@
         </w:rPr>
         <w:t xml:space="preserve"> </w:t>
       </w:r>
-      <w:proofErr w:type="spellStart"/>
-      <w:r>
-        <w:rPr>
-          <w:spacing w:val="-4"/>
-        </w:rPr>
-        <w:t>PyTorch</w:t>
-      </w:r>
-      <w:proofErr w:type="spellEnd"/>
-      <w:r>
-        <w:rPr>
-          <w:spacing w:val="-4"/>
-        </w:rPr>
-        <w:t>.</w:t>
+      <w:r>
+        <w:rPr>
+          <w:spacing w:val="-4"/>
+        </w:rPr>
+        <w:t>PyTorch.</w:t>
       </w:r>
       <w:r>
         <w:rPr>
@@ -4321,21 +4313,7 @@
         <w:rPr>
           <w:w w:val="90"/>
         </w:rPr>
-        <w:t>(</w:t>
-      </w:r>
-      <w:proofErr w:type="spellStart"/>
-      <w:r>
-        <w:rPr>
-          <w:w w:val="90"/>
-        </w:rPr>
-        <w:t>PyTorch</w:t>
-      </w:r>
-      <w:proofErr w:type="spellEnd"/>
-      <w:r>
-        <w:rPr>
-          <w:w w:val="90"/>
-        </w:rPr>
-        <w:t>,</w:t>
+        <w:t>(PyTorch,</w:t>
       </w:r>
       <w:r>
         <w:t xml:space="preserve"> </w:t>
@@ -4522,7 +4500,7 @@
           <w:w w:val="90"/>
           <w:sz w:val="21"/>
         </w:rPr>
-        <w:t xml:space="preserve">LLM &amp; AI Agents: </w:t>
+        <w:t>LLM &amp; AI Agents:</w:t>
       </w:r>
       <w:r>
         <w:rPr>
@@ -4530,7 +4508,7 @@
           <w:w w:val="90"/>
           <w:sz w:val="21"/>
         </w:rPr>
-        <w:t>Claude API, Claude Agent SDK, prompt engineering, multi-agent system design</w:t>
+        <w:t xml:space="preserve"> Claude Agent SDK, prompt engineering, multi-agent system design</w:t>
       </w:r>
     </w:p>
     <w:p>

</xml_diff>